<commit_message>
Zephaniah: MSG 전수 감사 2026-09-24 — EN 18건·KO 13건 수정, 게이트 7개 PASS
- EN: 1:4-6 sex-and-religion/star gods and goddesses/king-gods/or a prayer 복원,
  1:7-13 practices·Reverent silence 복원, 1:14-18 darkness at noon 복원,
  2:8-12 field of rocks·blow away 복원, 2:13-15 raccoons and coyotes·King of the Mountain 복원,
  3:1-5 every morning/At evening strong as ever/without conscience 복원,
  3:7/9-13/14-15/18-20 누락·오역 복원 (Daughter Zion/Jerusalem, venerated)
- KO: 1:1 아몬의 아들·1:3 Men and women·2:1-2 blown away 절·2:8-12 moonscape·blow away 복원,
  1:2/3:1 MSG 무첨가 삭제, 3:1 maim and kill souls 오역 수정,
  3장 3:7 중복 문단 삭제 (EN 8 vs KO 9 불일치 원인), 2:15 꿀잼→신나는 도시 순화
- § 헤더 7건 EN/KO 추가 (MSG ### 소제목, 구 감사본 배치 참조)
- verseRanges·msg_ranges 부여; validator PASS; completeness_check 잔여 1건 하이픈 오탐 문서화;
  build rows=27 VERIFY_DROPPED=0; pairing 20 rows OK;
  Docs 업로드 '스바냐 (Zephaniah): MSG + Teen EN + KO' 테이블 3/3 export-back OK
</commit_message>
<xml_diff>
--- a/gdocs_build/Zephaniah.docx
+++ b/gdocs_build/Zephaniah.docx
@@ -192,7 +192,7 @@
               <w:rPr>
                 <w:sz w:val="18"/>
               </w:rPr>
-              <w:t>자, 이건 하나님이 스바냐한테 전하는 메시지임. 스바냐가 누구냐면 히스기야의 현손이고 아마랴의 증손이고 그달랴의 손자고 구시의 아들이래. 요시야가 유다 왕으로 있을 때 받은 메시지인 거임.</w:t>
+              <w:t>자, 이건 하나님이 스바냐한테 전하는 메시지임. 스바냐가 누구냐면 히스기야의 현손이고 아마랴의 증손이고 그달랴의 손자고 구시의 아들이래. 아몬의 아들 요시야가 유다 왕으로 있을 때 받은 메시지인 거임.</w:t>
             </w:r>
           </w:p>
         </w:tc>
@@ -263,7 +263,7 @@
               <w:rPr>
                 <w:sz w:val="18"/>
               </w:rPr>
-              <w:t>하나님이 선포하셨는데, 완전 믿기 힘든 일임. "내가 온 땅을 싹 다 쓸어버릴 거임. 완전 대청소하는 거지."</w:t>
+              <w:t>하나님이 선포하셨음. "내가 온 땅을 싹 다 쓸어버릴 거임. 완전 대청소하는 거지."</w:t>
             </w:r>
           </w:p>
         </w:tc>
@@ -334,7 +334,7 @@
               <w:rPr>
                 <w:sz w:val="18"/>
               </w:rPr>
-              <w:t>"사람이고 동물이고, 새랑 물고기까지 죄짓게 만드는 건 싹 다 없애버릴 건데, 특히 사람들을 가만두지 않을 거임."</w:t>
+              <w:t>"남자고 여자고 동물이고, 새랑 물고기까지, 죄짓게 만드는 건 싹 다 없애버릴 건데, 특히 사람들은 가만두지 않을 거임."</w:t>
             </w:r>
           </w:p>
         </w:tc>
@@ -382,7 +382,7 @@
               <w:rPr>
                 <w:sz w:val="18"/>
               </w:rPr>
-              <w:t>'I'm starting with Judah and everyone in Jerusalem. I'm gonna sweep the place clean of every trace of those sketchy sex-and-religion Baal shrines and their priests. And those people who go up on their roofs at night to worship stars? They're out. Same for the people who say they worship God but are also praying to other gods just in case. And don't even get me started on the ones who've totally dumped God and don't even think about him anymore.'</w:t>
+              <w:t>'I'm starting with Judah and everyone in Jerusalem. I'm gonna get rid of all the sketchy stuff, like those Baal shrines that mixed sex with religion, and their priests. And those people who sneak up to their rooftops at night to worship the star gods and goddesses? They're out. Same for the people who say they worship God but are also praying to other king-gods just in case. And don't even get me started on the ones who've totally dumped God and don't even give him a thought or a prayer anymore.'</w:t>
             </w:r>
           </w:p>
         </w:tc>
@@ -405,7 +405,7 @@
               <w:rPr>
                 <w:sz w:val="18"/>
               </w:rPr>
-              <w:t>"일단 유다랑 예루살렘에 사는 사람들부터 시작이다. 성과 종교가 뒤섞인 바알 신전이랑 그 제사장들 흔적도 없이 다 쓸어버릴 거야. 밤에 옥상에 몰래 올라가서 별들한테 절하는 사람들도 다 없앨 거고, 하나님 섬긴다고 하면서 보험 삼아 다른 신들도 섬기는 사람들도 마찬가지임. 아, 그리고 하나님 아예 무시하고 기도 한 번 안 하는 사람들은 말할 것도 없지."</w:t>
+              <w:t>"일단 유다랑 예루살렘에 사는 사람들부터 시작이다. 성과 종교를 뒤섞은 바알 신전이랑 그 제사장들, 흔적도 없이 다 치워버릴 거야. 밤에 옥상에 몰래 올라가서 별의 신들한테 절하는 사람들도 다 없앨 거고, 하나님 섬긴다고 하면서 보험 삼아 다른 왕신들도 섬기는 사람들도 마찬가지임. 아, 그리고 하나님을 완전히 버리고, 생각조차 안 하고 기도 한 번 안 드리는 사람들은 말할 것도 없지."</w:t>
             </w:r>
           </w:p>
         </w:tc>
@@ -453,7 +453,7 @@
               <w:rPr>
                 <w:sz w:val="18"/>
               </w:rPr>
-              <w:t>'Yo, be quiet! Show some respect for God, the Master. Time's up. Judgment Day is coming, for real. The Holy Day is set, and the guests are ready. On that day, I'm gonna deal with the leaders and the princes, and anyone dressing up like foreign priests and priestesses, bringing in all their weird prayers. And I'm gonna deal with everyone who's bringing in pagan superstitions that turn holy places into hellholes. Judgment Day is coming, for real!' God's decree! 'You're gonna hear panic from the Fish Gate, screams from the Second Quarter, and crashing from the hills! All you shopkeepers on Market Street, you better cry, 'cause your money-making days are over. The god of money is dead. On Judgment Day, I'm gonna search every corner of Jerusalem. I'll find all those lazy people who are just sitting around, thinking, 'God doesn't do anything, good or bad. He's not involved, so why should we be?' But just you wait. They're gonna lose everything—their money, their houses, their land. They'll build houses and never live in them. They'll plant vineyards and never even get to taste the wine.'</w:t>
+              <w:t>'Yo, quiet now! Reverent silence before God, the Master. Time's up. Judgment Day is coming, for real. The Holy Day is set, and the guests are ready. On that day, I'm gonna deal with the leaders and the princes, and anyone dressing up like foreign priests and priestesses, bringing in their weird prayers and practices. And I'm gonna deal with everyone who's bringing in superstitions that are turning holy places into a mess. Judgment Day is coming, for real!' God's decree! 'You're gonna hear panic from the Fish Gate, screams from the Second Quarter, and crashing from the hills! All you shopkeepers on Market Street, you better cry, 'cause your money-making days are over. The god of money is dead. On Judgment Day, I'm gonna search every corner of Jerusalem. I'll find all those lazy people who are just sitting around, thinking, 'God doesn't do anything, good or bad. He's not involved, so why should we be?' But just you wait. They're gonna lose everything—their money, their houses, their land. They'll build houses and never live in them. They'll plant vineyards and never even get to taste the wine.'</w:t>
             </w:r>
           </w:p>
         </w:tc>
@@ -476,7 +476,7 @@
               <w:rPr>
                 <w:sz w:val="18"/>
               </w:rPr>
-              <w:t>"조용히 해! 주인님이신 하나님 앞에서 경건하게 있으라고. 이제 시간 다 됐음. 심판의 날이 코앞이야. 거룩한 날은 정해졌고, 초대받은 손님들도 다 준비됐음. 그 거룩한 날, 하나님의 심판의 날에 내가 지도자랑 왕자들을 벌할 거임. 외국 제사장처럼 옷 입고 이상한 기도나 드리는 사람들도 벌할 거고, 거룩한 곳을 지옥으로 만드는 이방 미신을 들여오는 사람들도 다 벌할 거임. 심판의 날이다!" 하나님이 선포하셨음! "성 어문에서는 비명 소리가 들리고, 제2구역에서는 공포의 울부짖음이, 언덕에서는 와르르 무너지는 소리가 들릴 거임! 시장 거리의 상인들아, 통곡해라! 돈 버는 시대는 끝났어. 돈의 신은 죽었다고. 심판의 날에 내가 예루살렘의 모든 골목과 벽장을 다 뒤질 거임. '하나님은 좋은 일이든 나쁜 일이든 아무것도 안 해. 우리랑 상관없으니까 우리도 신경 꺼.'라고 생각하면서 편하게 놀고먹는 사람들 다 찾아내서 벌할 거다. 근데 두고 봐. 걔네들 돈, 집, 땅 다 잃게 될 거임. 집 지어도 들어가 살지도 못하고, 포도밭 가꿔도 와인 맛도 못 볼걸."</w:t>
+              <w:t>"조용히 해! 주인님이신 하나님 앞에서 경건하게 있으라고. 이제 시간 다 됐음. 심판의 날이 코앞이야. 거룩한 날은 정해졌고, 초대받은 손님들도 다 거룩하게 준비됐음. 그 거룩한 날, 하나님의 심판의 날에 내가 지도자랑 왕자들을 벌할 거임. 외국 제사장이랑 여제사장처럼 차려입고 이상한 기도랑 의식을 들여오는 사람들도 벌할 거고, 거룩한 곳을 지옥 구덩이로 만드는 이방 미신을 들여오는 사람들도 다 벌할 거임. 심판의 날이다!" 하나님이 선포하셨음! "성 어문에서는 비명 소리가 들리고, 제2구역에서는 공포의 울부짖음이, 언덕에서는 와르르 무너지는 소리가 들릴 거임! 시장 거리의 상인들아, 통곡해라! 돈 버는 시대는 끝났어. 돈의 신은 죽었다고. 심판의 날에 내가 예루살렘의 모든 골목과 벽장을 다 뒤질 거임. '하나님은 좋은 일이든 나쁜 일이든 아무것도 안 해. 우리랑 상관없으니까 우리도 신경 꺼.'라고 생각하면서 편하게 놀고먹는 사람들 다 찾아내서 벌할 거다. 근데 두고 봐. 걔네들 돈, 집, 땅 다 잃게 될 거임. 집 지어도 들어가 살지도 못하고, 포도밭 가꿔도 와인 맛도 못 볼걸."</w:t>
             </w:r>
           </w:p>
         </w:tc>
@@ -569,7 +569,7 @@
               <w:rPr>
                 <w:sz w:val="18"/>
               </w:rPr>
-              <w:t>'The great Judgment Day of God is almost here. It's the final countdown... seven, six, five, four... It's gonna be a bitter and loud day, even the tough guys will be screaming for help. Judgment Day is payday—and I'm paying out my anger. It's gonna be a day of total chaos and pain, a day of darkness and storms, a day of terrifying war cries as cities get attacked. I'm gonna make things so bad, people won't know what hit them. They'll be stumbling around like they're blind. They've sinned against God! Their blood will be poured out like dirty water, and their insides will be thrown out like trash. Don't even think about trying to buy your way out of this. Your money is worthless. This is the Day of God's Judgment—my anger! I'm passionate about getting rid of sin—a fire that will burn up this corrupt world and all the corrupt people in it.'</w:t>
+              <w:t>'The great Judgment Day of God is almost here. It's the final countdown... seven, six, five, four... It's gonna be a bitter and loud day, even the tough guys will be screaming for help. Judgment Day is payday—and I'm paying out my anger. It's gonna be a day of total chaos and pain, a day of darkness at noon, a day of black storm clouds, a day of bloodcurdling war cries as forts get attacked and defenses get smashed. I'm gonna make things so bad, people won't know what hit them. They'll be stumbling around like they're blind. They've sinned against God! Their blood will be poured out like dirty water, and their guts shoveled into slop buckets like trash. Don't even think about trying to buy your way out of this. Your money is worthless. This is the Day of God's Judgment—my anger! I care about sin with a fiery passion—a fire to burn up this corrupt world and finish off all the corrupt people in it.'</w:t>
             </w:r>
           </w:p>
         </w:tc>
@@ -592,7 +592,7 @@
               <w:rPr>
                 <w:sz w:val="18"/>
               </w:rPr>
-              <w:t>"하나님의 위대한 심판의 날이 거의 다 왔어. 이제 카운트다운 들어간다... 일곱, 여섯, 다섯, 넷... 내 심판의 날에는 비통하고 시끄러운 울음소리가 가득할 거고, 힘센 장사들도 도와달라고 소리 지를 거임. 심판의 날은 바로 월급날임. 내 분노를 받는 날이지. 고통과 괴로움의 날, 재앙과 파멸의 날, 한낮에도 캄캄한 어둠의 날, 시커먼 폭풍 구름의 날, 성채가 공격당하고 방어벽이 무너질 때 울려 퍼지는 소름 끼치는 전쟁 함성의 날이다. 내가 상황을 너무 안 좋게 만들어서 사람들 정신 못 차릴 거임. 눈먼 사람처럼 더듬거리면서 다닐걸. 하나님한테 죄를 지었으니까! 걔네 피는 설거지물처럼 쏟아지고, 내장은 거름처럼 버려질 거임. 돈으로 해결할 생각 마라. 너네 돈은 아무 쓸모없어. 이날은 하나님의 심판의 날, 내 분노의 날이다! 나는 죄를 불같이 싫어해. 이 썩은 세상을 태워버릴 불, 썩은 사람들을 끝장낼 거대한 불길로 말이야."</w:t>
+              <w:t>"하나님의 위대한 심판의 날이 거의 다 왔어. 이제 카운트다운 들어간다... 일곱, 여섯, 다섯, 넷... 내 심판의 날에는 비통하고 시끄러운 울음소리가 가득할 거고, 힘센 장사들도 도와달라고 소리 지를 거임. 심판의 날은 바로 월급날임. 내 분노를 받는 날이지. 고통과 괴로움의 날, 재앙과 파멸의 날, 한낮에도 캄캄한 어둠의 날, 시커먼 폭풍 구름의 날, 성채가 공격당하고 방어벽이 무너질 때 울려 퍼지는 소름 끼치는 전쟁 함성의 날이다. 내가 상황을 너무 안 좋게 만들어서 사람들 정신 못 차릴 거임. 눈먼 사람처럼 더듬거리면서 다닐걸. 하나님한테 죄를 지었으니까! 걔네 피는 설거지물처럼 쏟아지고, 내장은 거름통에 퍼담아 버려질 거임. 돈으로 해결할 생각 마라. 너네 돈은 아무 쓸모없어. 이날은 하나님의 심판의 날, 내 분노의 날이다! 나는 죄를 불같이 싫어해. 이 썩은 세상을 태워버릴 불, 썩은 사람들을 끝장낼 거대한 불길로 말이야."</w:t>
             </w:r>
           </w:p>
         </w:tc>
@@ -775,7 +775,7 @@
               <w:rPr>
                 <w:sz w:val="18"/>
               </w:rPr>
-              <w:t>야, 정신 좀 차려봐라. 너네 지금 뭘 원하는지도 모르는, 진짜 답 없는 나라꼴임. 하나님의 심판의 분노가 너네를 덮치기 전에, 그 무서운 날이 오기 전에 빨리 정신 차리라고.</w:t>
+              <w:t>야, 정신 좀 차려봐라. 너네 지금 뭘 원하는지도 모르는, 진짜 답 없는 나라꼴임. 바람에 날아가는 나뭇잎처럼 날아가 버리기 전에, 하나님의 심판의 분노가 너네를 덮치기 전에, 심판의 날의 진노가 완전히 내리기 전에 빨리 정신 차리라고.</w:t>
             </w:r>
           </w:p>
         </w:tc>
@@ -846,7 +846,7 @@
               <w:rPr>
                 <w:sz w:val="18"/>
               </w:rPr>
-              <w:t>그러니까 하나님의 정의를 따르는 겸손한 사람들아, 다들 하나님을 찾아라. 올바른 길을 찾고, 조용히 절제하는 삶을 살아. 그러면 어쩌면 하나님이 분노하시는 그날에 너네는 무사할지도 모름.</w:t>
+              <w:t>그러니까 하나님의 정의를 따르는 겸손한 사람들아, 다들 하나님을 찾아라. 올바른 길을 찾고, 조용히 절제하는 삶을 살아. 그러면 어쩜 하나님이 분노하시는 그날에 너네는 무사할지도 모름.</w:t>
             </w:r>
           </w:p>
         </w:tc>
@@ -1081,7 +1081,7 @@
               <w:rPr>
                 <w:sz w:val="18"/>
               </w:rPr>
-              <w:t>'I've heard all the nasty things Moab has said, and the insults from Ammon. They've been dissing my people and acting all high and mighty on Israel's borders. So, as sure as I'm the living God,' says the Lord of Angel Armies, Israel's personal God, 'Moab is gonna end up like Sodom, and Ammon like Gomorrah—a field of rocks and a salty wasteland, a total ruin forever. What's left of my people will take them over and clean them out. This is what they get for being so proud and for mocking the people of the God of Angel Armies. God's gonna show them how terrifying he is. All the man-made gods will just shrivel up and disappear. And everyone, no matter where they are, will bow down and worship him. And yeah, you Ethiopians too—you're gonna die. I'll make sure of it.'</w:t>
+              <w:t>'I've heard all the nasty taunts from Moab, and the mockeries flung by Ammon. They've been talking cruel trash about my people and strutting around all self-important along Israel's borders. So, as sure as I'm the living God,' says the God-of-the-Angel-Armies, Israel's personal God, 'Moab is gonna end up a ruin like Sodom, and Ammon a ghost town like Gomorrah—one a field of rocks, the other a sterile salt flat, a moonscape forever. What's left of my people will finish them off, pick them clean, and take over. This is what they get for their bloated pride, for their taunts and mockeries of the people of the God-of-the-Angel-Armies. God will be seen as truly terrible—a Holy Terror. All the earth-made gods will shrivel up and blow away. And everyone, wherever they are, far or near, will fall to the ground and worship him. And yeah, you Ethiopians too—you're gonna die. I'll see to it.'</w:t>
             </w:r>
           </w:p>
         </w:tc>
@@ -1104,7 +1104,7 @@
               <w:rPr>
                 <w:sz w:val="18"/>
               </w:rPr>
-              <w:t>'내가 모압이 막말하는 거랑 암몬이 조롱하는 소리를 다 들었다. 걔네가 내 백성을 깔보면서 이스라엘 국경에서 거들먹거리는 거 말이야. 그러므로 내가 살아있는 한, 이스라엘의 하나님, 만군의 주가 맹세하는데, 모압은 소돔처럼 폐허가 되고 암몬은 고모라처럼 유령 도시가 될 거다. 하나는 돌멩이 밭이 되고, 다른 하나는 소금 밭이 돼서 영원히 황무지가 될 거임. 내 백성 중에 남은 자들이 걔네를 끝장내고, 싹 다 털어서 차지할 거다. 이게 다 걔네가 교만해서, 만군의 주의 백성을 조롱하고 막말한 대가다. 하나님이 진짜 무서운 분이라는 걸 보여줄 거임. 땅에 있는 모든 신들은 다 쪼그라들어서 사라질 거고, 멀리 있든 가까이 있든 모든 사람이 땅에 엎드려 그분께 경배하게 될 거다. 그리고 너네 에티오피아 사람들도 마찬가지야. 너네도 죽게 될 거다. 내가 그렇게 만들 거임.'</w:t>
+              <w:t>'내가 모압의 막말이랑 암몬의 조롱을 다 들었다. 걔네가 내 백성을 깔보면서 이스라엘 국경에서 거들먹거리는 거 말이야. 그러므로 내가 살아있는 한, 만군의 주이신 이스라엘의 하나님이 맹세하는데, 모압은 소돔처럼 폐허가 되고 암몬은 고모라처럼 유령 도시가 될 거다. 하나는 돌밭, 다른 하나는 소금밭이 돼서, 달 표면처럼 영원히 황무지가 될 거임. 내 백성 중에 남은 자들이 걔네를 끝장내고, 싹 다 털어서 차지할 거다. 이게 다 걔네가 교만해서, 만군의 주의 백성을 조롱하고 막말한 대가다. 하나님이 진짜 무서운 분이라는 걸 보여줄 거임. 땅에 있는 모든 신들은 다 쪼그라들어서 바람에 날아갈 거고, 멀리 있든 가까이 있든 모든 사람이 땅에 엎드려 그분께 경배하게 될 거다. 그리고 너네 에티오피아 사람들도 마찬가지야. 너네도 죽게 될 거다. 내가 그렇게 만들 거임.'</w:t>
             </w:r>
           </w:p>
         </w:tc>
@@ -1152,7 +1152,7 @@
               <w:rPr>
                 <w:sz w:val="18"/>
               </w:rPr>
-              <w:t>Then God's gonna reach up north and destroy Assyria. He'll turn Nineveh into a wasteland, as dry and empty as a desert. That ghost town of a city will be a hangout for wild animals. Raccoons and coyotes will be bedding down in the ruins. Owls will be hooting from the windows, and ravens will be croaking in the doorways. All that fancy woodwork will just be a perch for birds. Is this really that super fun city that thought it was the best, the one that bragged, 'I'm the Number-One City! I'm King of the Mountain!'? Well, look at it now—a total dump, a place for wild animals. People who walk by just shake their heads and move on.</w:t>
+              <w:t>Then God's gonna reach into the north and destroy Assyria. He'll waste Nineveh, leaving her dry and treeless as a desert. That ghost town of a city, a haunt for wild animals—Nineveh will be home to raccoons and coyotes, bedding down in its ruins. Owls will hoot in the windows, ravens will croak in the doorways—all that fancy woodwork now just a perch for birds. Can this really be the famous Fun City that had it made, the one that boasted, 'I'm the Number-One City! I'm King of the Mountain!'? So why is the place deserted now, a lair for wild animals? Passersby hardly give it a look—they just dismiss it with a wave.</w:t>
             </w:r>
           </w:p>
         </w:tc>
@@ -1175,7 +1175,7 @@
               <w:rPr>
                 <w:sz w:val="18"/>
               </w:rPr>
-              <w:t>그런 다음에 하나님은 북쪽으로 손을 뻗어서 앗시리아를 멸망시키실 거임. 니느웨를 황폐하게 만들어서, 사막처럼 메마르고 나무 한 그루 없는 곳으로 만드실 거야. 그 유령 도시는 야생 동물들의 소굴이 될 거고, 너구리랑 코요테가 폐허 속에서 잠자리를 잡을 거임. 창문에서는 부엉이가 울고, 문간에서는 까마귀가 울어댈 거고. 그 화려했던 목조 건물은 이제 새들이 앉는 횃대가 될 뿐임. 여기가 그 잘나가던 '신나는 도시', '내가 짱이다! 내가 산꼭대기의 왕이다!'라고 자랑하던 그 도시가 맞냐? 근데 왜 지금은 이렇게 버려져서 야생 동물들의 소굴이 됐냐? 지나가는 사람들은 그냥 고개를 저으며 지나감.</w:t>
+              <w:t>그런 다음에 하나님은 북쪽으로 손을 뻗어서 앗시리아를 멸망시키실 거임. 니느웨를 황폐하게 만들어서, 사막처럼 메마르고 나무 한 그루 없는 곳으로 만드실 거야. 그 유령 도시는 야생 동물들의 소굴이 될 거고, 너구리랑 코요테가 폐허 속에서 잠자리를 잡을 거임. 창문에서는 부엉이가 울고, 문간에서는 까마귀가 울어댈 거고. 그 화려했던 목조 건물은 이제 새들이 앉는 횃대가 될 뿐임. 여기가 그 유명한 '신나는 도시', 잘나가던 시절에 '내가 최고다! 내가 산꼭대기의 왕이다!'라고 뽐내던 그 도시가 맞냐? 근데 왜 지금은 이렇게 버려져서 야생 동물들의 소굴이 됐냐? 지나가는 사람들은 그냥 손짓으로 무시하고 지나감.</w:t>
             </w:r>
           </w:p>
         </w:tc>
@@ -1335,7 +1335,7 @@
               <w:rPr>
                 <w:sz w:val="18"/>
               </w:rPr>
-              <w:t>Man, it's over for that rebel city, the one full of bullies—Sewer City, for real. The city that wouldn't take advice, wouldn't accept being called out, wouldn't trust God, and wouldn't even get close to Him. Its own leaders are like hungry lions, its judges are like wolves prowling for their next meal. Its prophets are total fakes, just looking out for themselves. You can't trust them. Its priests desecrate the Sanctuary and use God's law like a weapon to maim and kill souls. But God is still there, in the middle of it all, totally righteous and untouched by the evil. He's at it day after day, serving justice. He never stops. But the evil people, with zero shame, just keep on doing their thing.</w:t>
+              <w:t>Man, it's over for that rebel city, the home of oppressors—Sewer City, for real. The city that wouldn't take advice, wouldn't accept correction, wouldn't trust God, wouldn't even get close to her own God! Her very own leaders are rapacious lions. Her judges are rapacious timber wolves, out every morning prowling for a fresh kill. Her prophets are out for whatever they can get—total opportunists. You can't trust them. Her priests desecrate the Sanctuary. They use God's law as a weapon to maim and kill souls. Yet God remains righteous in her midst, untouched by the evil. He stays at it, day after day, meting out justice. At evening he's still at it, strong as ever. But evil men and women, without conscience and without shame, just keep on persisting in evil.</w:t>
             </w:r>
           </w:p>
         </w:tc>
@@ -1358,7 +1358,7 @@
               <w:rPr>
                 <w:sz w:val="18"/>
               </w:rPr>
-              <w:t>진짜 반역의 도시, 폭군들의 소굴이었던 예루살렘은 이제 망했대. 조언도 안 듣고, 훈계도 무시하고, 하나님을 믿지도 않고, 자기 하나님께 가까이 가지도 않았던 그 도시 말이야. 그 도시의 지도자들은 굶주린 사자 같았고, 재판관들은 매일 아침 새로운 사냥감을 찾아 헤매는 늑대들이었대. 선지자들은 자기 이익만 챙기는 기회주의자들이라 믿을 수가 없었고, 제사장들은 성소를 더럽히고 하나님의 법을 자기들 무기처럼 써서 사람들 영혼을 다치게 했대. 근데 하나님은 그 한가운데서 여전히 의로우셨고, 악에 물들지 않으셨대. 매일같이 정의를 행하셨고, 저녁에도 여전히 강하셨대. 근데 악한 사람들은 양심도 없고 부끄러움도 없이 계속 악을 행했대.</w:t>
+              <w:t>반역의 도시, 압제자들의 소굴 — 이제 끝장이야, 진짜. 조언도 안 듣고, 훈계도 무시하고, 하나님을 믿지도 않고, 자기 하나님께 가까이 가지도 않았던 그 도시 말이야. 그 도시의 지도자들은 탐욕스러운 사자 같았고, 재판관들은 매일 아침 새로운 사냥감을 찾아 헤매는 탐욕스러운 늑대들이었대. 선지자들은 자기 이익만 챙기는 기회주의자들이라 믿을 수가 없었고, 제사장들은 성소를 더럽히고 하나님의 법을 무기로 삼아 사람들의 영혼을 베고 죽였대. 근데 하나님은 그 한가운데서 여전히 의로우셨고, 악에 물들지 않으셨대. 날마다 정의를 행하셨고, 저녁에도 여전히 강하셨대. 근데 악한 남녀는 양심도 없고 부끄러움도 없이 계속 악을 행했대.</w:t>
             </w:r>
           </w:p>
         </w:tc>
@@ -1477,7 +1477,7 @@
               <w:rPr>
                 <w:sz w:val="18"/>
               </w:rPr>
-              <w:t>“I thought, ‘Surely now they’ll respect me, take my advice, and escape the punishment I have planned.’ But nope. It didn't even bother them. They got up bright and early and went right back to their old, messed-up ways.”</w:t>
+              <w:t>“I thought, ‘Surely she’ll honor me now, accept my discipline and correction, find a way out of the trouble she’s in, find relief from the punishment I’m bringing.’ But it didn’t faze her. Bright and early she was up at it again, doing the same old things.”</w:t>
             </w:r>
           </w:p>
         </w:tc>
@@ -1548,7 +1548,7 @@
               <w:rPr>
                 <w:sz w:val="18"/>
               </w:rPr>
-              <w:t>God's decree is like, “Fine, if that's what you want, just wait. Your court date is coming, and I'll be there with the receipts. I'm gathering all the nations and kingdoms to pour out my anger on them. My passion is a fire that will literally purify the whole earth.”</w:t>
+              <w:t>God's decree: “Well, if that's what you want, stick around. Your day in court is coming, but remember—I'll be there with the evidence. I'll bring all the nations to the courtroom, round up all the kingdoms, and let them feel the brunt of my anger, my raging wrath. My zeal is a fire that will purge and purify the earth.”</w:t>
             </w:r>
           </w:p>
         </w:tc>
@@ -1664,7 +1664,7 @@
               <w:rPr>
                 <w:sz w:val="18"/>
               </w:rPr>
-              <w:t>“But in the end, I'm gonna flip the script for the people. I'll give them a pure language, so they can all worship God together, united, working as a team. They'll come from all over, even from beyond the rivers of Ethiopia, praying and bringing offerings. All my scattered, exiled people will come home. You won't have to be ashamed of your rebellious past anymore. I'll get rid of your arrogant leaders. No more flexing on my holy hill. I'll leave a core group of humble people, what's left of Israel, who will truly rely on God. This holy crew won't do wrong. They won't lie or try to manipulate people. They'll be content and live in peace, no anxiety.”</w:t>
+              <w:t>“But in the end, I'm gonna turn things around for the people. I'll give them a language undistorted, unpolluted—words to address God in worship and, united, to serve me with their shoulders to the wheel. They'll come from beyond the Ethiopian rivers, they'll come praying—all my scattered, exiled people will come home with offerings for worship. You'll no longer have to be ashamed of all those acts of rebellion. I'll have gotten rid of your arrogant leaders. No more pious strutting on my holy hill! I'll leave a core of people among you who are poor in spirit—what's left of Israel, the real Israel. They'll make their home in God. This core holy people will not do wrong. They won't lie, won't use words to flatter or seduce. Content with who they are and where they are, unanxious, they'll live at peace.”</w:t>
             </w:r>
           </w:p>
         </w:tc>
@@ -1687,7 +1687,7 @@
               <w:rPr>
                 <w:sz w:val="18"/>
               </w:rPr>
-              <w:t>"결국에는 내가 사람들을 위해 모든 상황을 뒤집을 거야. 왜곡되지 않고 오염되지 않은 언어를 그들에게 줄 거고, 그 말로 하나님을 예배하고, 다 함께 어깨를 맞대고 나를 섬기게 될 거야. 에티오피아 강 건너편에서도 사람들이 와서 기도할 거고, 흩어졌던 내 모든 백성이 예배를 위한 제물을 가지고 집으로 돌아올 거야. 너희는 더 이상 그 모든 반역 행위 때문에 부끄러워할 필요가 없어. 내가 너희의 거만한 지도자들을 다 제거할 거거든. 내 거룩한 산에서 더 이상 거들먹거리는 일은 없을 거야! 내가 너희 가운데 영적으로 가난한 사람들, 진짜 이스라엘의 남은 자들을 남겨둘 거야. 그들은 하나님 안에서 자기 집을 찾을 거야. 이 거룩한 남은 자들은 악을 행하지 않을 거고, 거짓말도 안 하고, 사람을 꾀거나 유혹하는 말도 쓰지 않을 거야. 자기 자신과 자기 자리에 만족하면서, 불안 없이 평화롭게 살게 될 거야."</w:t>
+              <w:t>"결국에는 내가 사람들을 위해 모든 상황을 뒤집을 거야. 왜곡되지 않고 오염되지 않은 언어를 그들에게 줄 거고, 그 말로 하나님을 예배하고, 다 함께 어깨를 맞대고 나를 섬기게 될 거야. 에티오피아 강 건너편에서도 사람들이 와서 기도할 거고, 흩어졌던 내 모든 백성이 예배를 위한 제물을 가지고 집으로 돌아올 거야. 너희는 더 이상 그 모든 반역 행위 때문에 부끄러워할 필요가 없어. 내가 너희의 거만한 지도자들을 다 제거할 거거든. 내 거룩한 산에서 더 이상 거들먹거리는 일은 없을 거야! 내가 너희 가운데 영적으로 가난한 사람들, 진짜 이스라엘의 남은 자들을 남겨둘 거야. 그들은 하나님 안에서 자기 집을 찾을 거야. 이 거룩한 핵심 남은 자들은 악을 행하지 않을 거고, 거짓말도 안 하고, 사람을 꾀거나 유혹하는 말도 쓰지 않을 거야. 자기 자신과 자기 자리에 만족하면서, 불안 없이 평화롭게 살게 될 거야."</w:t>
             </w:r>
           </w:p>
         </w:tc>
@@ -1735,7 +1735,7 @@
               <w:rPr>
                 <w:sz w:val="18"/>
               </w:rPr>
-              <w:t>So sing, Zion! Shout it out, Israel! Be happy and celebrate, Jerusalem! God has cancelled the charges against you and made your enemies run. From now on, God is Israel's king, right in the center of everything. You'll never have to fear evil again!</w:t>
+              <w:t>So sing, Daughter Zion! Raise your voices, Israel! Daughter Jerusalem, be happy! celebrate! God has reversed his judgments against you and sent your enemies off chasing their tails. From now on, God is Israel's king, in charge at the center. There's nothing to fear from evil ever again!</w:t>
             </w:r>
           </w:p>
         </w:tc>
@@ -1758,7 +1758,7 @@
               <w:rPr>
                 <w:sz w:val="18"/>
               </w:rPr>
-              <w:t>그러니 노래해라, 시온의 딸아! 목소리를 높여라, 이스라엘아! 예루살렘의 딸아, 기뻐하고 축하해라! 하나님이 너에 대한 심판을 뒤집으시고, 네 원수들을 다 쫓아내셨어. 이제부터는 하나님이 이스라엘의 왕이시고, 중심에서 모든 걸 다스리실 거야. 다시는 악을 두려워할 필요가 없어!</w:t>
+              <w:t>그러니 노래해라, 시온의 딸아! 목소리를 높여라, 이스라엘아! 예루살렘의 딸아, 기뻐하고 축하해라! 하나님이 너에 대한 심판을 뒤집으시고, 네 원수들을 꼬리 감추고 도망치게 하셨어. 이제부터는 하나님이 이스라엘의 왕이시고, 중심에서 모든 걸 다스리실 거야. 다시는 악을 두려워할 필요가 없어!</w:t>
             </w:r>
           </w:p>
         </w:tc>
@@ -1851,7 +1851,7 @@
               <w:rPr>
                 <w:sz w:val="18"/>
               </w:rPr>
-              <w:t>Jerusalem will be told: “Don’t be scared. Dear Zion, don’t give up. Your God is with you; he's a mighty Warrior who is here to save you. He's so happy to have you back. He will calm you with his love and sing over you with joy.”</w:t>
+              <w:t>Jerusalem will be told: “Don’t be afraid. Dear Zion, don’t despair. Your God is present among you, a strong Warrior there to save you. Happy to have you back, he'll calm you with his love and delight you with his songs.”</w:t>
             </w:r>
           </w:p>
         </w:tc>
@@ -1874,7 +1874,7 @@
               <w:rPr>
                 <w:sz w:val="18"/>
               </w:rPr>
-              <w:t>예루살렘에 이런 말이 들릴 거래. "두려워하지 마. 사랑하는 시온아, 절망하지 마. 너의 하나님이 네 가운데 계시고, 너를 구원할 강한 전사로 거기에 계셔. 너를 되찾아서 행복해하시고, 그의 사랑으로 너를 진정시키고, 너를 보며 기쁨의 노래를 부르실 거야."</w:t>
+              <w:t>예루살렘에 이런 말이 들릴 거래. "두려워하지 마. 사랑하는 시온아, 절망하지 마. 너의 하나님이 네 가운데 계시고, 너를 구원할 강한 전사로 거기에 계셔. 너를 되찾아서 행복해하시고, 그의 사랑으로 너를 진정시키고, 기쁨의 노래로 너를 즐겁게 하실 거야."</w:t>
             </w:r>
           </w:p>
         </w:tc>
@@ -1922,7 +1922,7 @@
               <w:rPr>
                 <w:sz w:val="18"/>
               </w:rPr>
-              <w:t>“The sadness from your time in exile will be gone. I, your God, will get rid of it for you. You've carried that weight long enough. At the same time, I'll deal with everyone who made your life a living nightmare. I'll heal the broken and bring home the lost. In the very places where they were shamed, they will be famous. On that day, I'll bring you all back home—a massive family reunion! You'll be famous and honored all over the world. You'll see it with your own eyes—all those painful goodbyes turned into joyful reunions!” That's God's promise.</w:t>
+              <w:t>“The accumulated sorrows of your exile will dissipate. I, your God, will get rid of them for you. You've carried those burdens long enough. At the same time, I'll get rid of all those who've made your life miserable. I'll heal the maimed; I'll bring home the homeless. In the very countries where they were hated, they will be venerated. On Judgment Day I'll bring you back home—a great family gathering! You'll be famous and honored all over the world. You'll see it with your own eyes—all those painful partings turned into reunions!” That's God's promise.</w:t>
             </w:r>
           </w:p>
         </w:tc>

</xml_diff>